<commit_message>
#123tp5xbj2k Modified the week6 project report
</commit_message>
<xml_diff>
--- a/docs/weekly-reports/Week6_Progress_Report.docx
+++ b/docs/weekly-reports/Week6_Progress_Report.docx
@@ -103,7 +103,7 @@
           <w:sz w:val="24"/>
           <w:szCs w:val="24"/>
         </w:rPr>
-        <w:t>Week 6 focused on making the helpdesk agent’s workflow state explicit, introducing a justified form of persistent case memory, and defining a clear interface for future interoperability. The week’s work extends the bounded agent loop and tool orchestration developed earlier. Deliverables now include a state model, a memory and data-handling note, a memory-enabled prototype with four demonstration scenarios, and an MCP-style interface specification.</w:t>
+        <w:t>Week 6 focused on explicit workflow state, justified case-history memory, and interoperability. Building on the bounded agent loop and tool orchestration, the group produced a state model, a memory and data-handling note, a memory/state prototype with four scenarios, and an MCP-style interface specification. The Week 6 demo was run, and all four scenario assertions passed in the terminal output provided for this report.</w:t>
       </w:r>
     </w:p>
     <w:p>
@@ -249,7 +249,7 @@
           <w:sz w:val="24"/>
           <w:szCs w:val="24"/>
         </w:rPr>
-        <w:t xml:space="preserve">Memory-enabled implementation. </w:t>
+        <w:t xml:space="preserve">Memory/state implementation. </w:t>
       </w:r>
       <w:r>
         <w:rPr>
@@ -258,7 +258,7 @@
           <w:sz w:val="24"/>
           <w:szCs w:val="24"/>
         </w:rPr>
-        <w:t>Added a Week 6 controller and in-process MemoryStore. At the start of a request, the controller loads records for the customer identified by the trusted session. After confirmed ticket creation, controller code writes a validated, bounded summary. The model receives prior case information as read-only context; it does not directly write memory.</w:t>
+        <w:t>Added a Week 6 controller and an in-process MemoryStore shared across requests during one demo run. It loads records for the trusted session customer and writes a validated, bounded summary after confirmed ticket creation. The Gemini planner is designed to receive prior cases as read-only context; the deterministic planner used by the demo follows scripted actions. The store is not durable across process restarts.</w:t>
       </w:r>
     </w:p>
     <w:p>
@@ -288,7 +288,7 @@
           <w:sz w:val="24"/>
           <w:szCs w:val="24"/>
         </w:rPr>
-        <w:t xml:space="preserve">Demonstration scenarios. </w:t>
+        <w:t xml:space="preserve">Demonstration results. </w:t>
       </w:r>
       <w:r>
         <w:rPr>
@@ -297,7 +297,7 @@
           <w:sz w:val="24"/>
           <w:szCs w:val="24"/>
         </w:rPr>
-        <w:t>The demo code defines four cases: create a ticket and save its history; return later and look up the prior ticket; reject another customer’s ticket request; and require a separate approval step for escalation even when the case is in memory. The source includes outcome assertions, but no execution trace or saved run output is present; runtime success is therefore not reported as verified.</w:t>
+        <w:t>The provided terminal output shows all four scenarios completed with passing assertions: ticket created and saved to memory (TICKET_CREATED); returning customer’s ticket status retrieved (TICKET_STATUS_RETURNED); cross-customer access denied (AUTHORIZATION_DENIED); and escalation completed after a simulated approval (ESCALATED_AFTER_APPROVAL). Scenario 2’s scripted action already contains the ticket ID, so the run confirms memory was loaded and the lookup succeeded, but does not isolate memory as the reason the planner selected that ID. The run output was shared for this report but is not yet archived in the repository.</w:t>
       </w:r>
     </w:p>
     <w:p>
@@ -374,7 +374,7 @@
           <w:sz w:val="24"/>
           <w:szCs w:val="24"/>
         </w:rPr>
-        <w:t>The state model separates temporary workflow information from persistent case history. Request identity comes from the authenticated session; evidence and tool calls are retained in the workflow trace; approval status is controlled by the application or a human; and the final response and stop reason are recorded at completion. The model can propose an action, while trusted code validates and executes it.</w:t>
+        <w:t>The state model separates per-request workflow information from case-history memory. Request identity comes from the authenticated session; evidence and tool calls are retained in the workflow; approval status is controlled by trusted application code or a human; and the final response and stop reason are recorded at completion. The model may propose an action, while trusted code validates and executes it.</w:t>
       </w:r>
     </w:p>
     <w:p>
@@ -394,7 +394,7 @@
           <w:sz w:val="24"/>
           <w:szCs w:val="24"/>
         </w:rPr>
-        <w:t>Memory exists to support continuity: a returning customer can ask about an open case without restating the full issue or ticket reference. Ownership checks bind reads to the session customer. Memory cannot change identity, authorize escalation, or decide a financial or account outcome. This directly addresses the weekly requirement that memory help a legitimate task without silently controlling a critical decision.</w:t>
+        <w:t>The documented use case is continuity for a returning customer with an open case. In the demo, the controller loaded the customer’s stored case and the ticket lookup returned its status without a ticket ID in the customer’s message. The scripted planner supplied that ID in its action, however, so a follow-up using the memory-aware Gemini planner would provide stronger evidence that memory itself drives the selection. Ownership checks bind reads to the session customer; memory cannot change identity, authorize escalation or determine a financial outcome. The escalation scenario also shows the approval gate still runs, using a simulated approval callback.</w:t>
       </w:r>
     </w:p>
     <w:p>
@@ -511,12 +511,6 @@
             <w:insideH w:val="single" w:color="000000" w:sz="4" w:space="0"/>
             <w:insideV w:val="single" w:color="000000" w:sz="4" w:space="0"/>
           </w:tblBorders>
-          <w:tblCellMar>
-            <w:top w:w="0" w:type="dxa"/>
-            <w:left w:w="108" w:type="dxa"/>
-            <w:bottom w:w="0" w:type="dxa"/>
-            <w:right w:w="108" w:type="dxa"/>
-          </w:tblCellMar>
         </w:tblPrEx>
         <w:trPr>
           <w:jc w:val="center"/>
@@ -657,12 +651,6 @@
             <w:insideH w:val="single" w:color="000000" w:sz="4" w:space="0"/>
             <w:insideV w:val="single" w:color="000000" w:sz="4" w:space="0"/>
           </w:tblBorders>
-          <w:tblCellMar>
-            <w:top w:w="0" w:type="dxa"/>
-            <w:left w:w="108" w:type="dxa"/>
-            <w:bottom w:w="0" w:type="dxa"/>
-            <w:right w:w="108" w:type="dxa"/>
-          </w:tblCellMar>
         </w:tblPrEx>
         <w:trPr>
           <w:jc w:val="center"/>
@@ -732,12 +720,6 @@
             <w:insideH w:val="single" w:color="000000" w:sz="4" w:space="0"/>
             <w:insideV w:val="single" w:color="000000" w:sz="4" w:space="0"/>
           </w:tblBorders>
-          <w:tblCellMar>
-            <w:top w:w="0" w:type="dxa"/>
-            <w:left w:w="108" w:type="dxa"/>
-            <w:bottom w:w="0" w:type="dxa"/>
-            <w:right w:w="108" w:type="dxa"/>
-          </w:tblCellMar>
         </w:tblPrEx>
         <w:trPr>
           <w:jc w:val="center"/>
@@ -807,12 +789,6 @@
             <w:insideH w:val="single" w:color="000000" w:sz="4" w:space="0"/>
             <w:insideV w:val="single" w:color="000000" w:sz="4" w:space="0"/>
           </w:tblBorders>
-          <w:tblCellMar>
-            <w:top w:w="0" w:type="dxa"/>
-            <w:left w:w="108" w:type="dxa"/>
-            <w:bottom w:w="0" w:type="dxa"/>
-            <w:right w:w="108" w:type="dxa"/>
-          </w:tblCellMar>
         </w:tblPrEx>
         <w:trPr>
           <w:jc w:val="center"/>
@@ -851,8 +827,6 @@
           </w:tcPr>
           <w:p>
             <w:pPr>
-              <w:spacing w:before="40" w:after="40"/>
-              <w:jc w:val="both"/>
               <w:rPr>
                 <w:rFonts w:hint="default" w:ascii="Times New Roman" w:hAnsi="Times New Roman" w:cs="Times New Roman"/>
                 <w:sz w:val="24"/>
@@ -862,12 +836,11 @@
             <w:r>
               <w:rPr>
                 <w:rFonts w:hint="default" w:ascii="Times New Roman" w:hAnsi="Times New Roman" w:cs="Times New Roman"/>
-                <w:b w:val="0"/>
                 <w:color w:val="000000"/>
                 <w:sz w:val="24"/>
                 <w:szCs w:val="24"/>
               </w:rPr>
-              <w:t>Four scenarios are scripted; run output or trace still needs to be captured.</w:t>
+              <w:t>Run completed; all four scenario assertions passed in the terminal output provided. Transcript not yet archived in repository; Scenario 2 uses a scripted ticket ID.</w:t>
             </w:r>
           </w:p>
         </w:tc>
@@ -951,12 +924,6 @@
             <w:insideH w:val="single" w:color="000000" w:sz="4" w:space="0"/>
             <w:insideV w:val="single" w:color="000000" w:sz="4" w:space="0"/>
           </w:tblBorders>
-          <w:tblCellMar>
-            <w:top w:w="0" w:type="dxa"/>
-            <w:left w:w="108" w:type="dxa"/>
-            <w:bottom w:w="0" w:type="dxa"/>
-            <w:right w:w="108" w:type="dxa"/>
-          </w:tblCellMar>
         </w:tblPrEx>
         <w:trPr>
           <w:jc w:val="center"/>
@@ -1069,6 +1036,7 @@
           <w:color w:val="000000"/>
           <w:sz w:val="24"/>
           <w:szCs w:val="24"/>
+          <w:lang w:val="en-US"/>
         </w:rPr>
       </w:pPr>
       <w:r>
@@ -1078,7 +1046,7 @@
           <w:sz w:val="24"/>
           <w:szCs w:val="24"/>
         </w:rPr>
-        <w:t xml:space="preserve">The week produced the required design artifacts and a working-code prototype for explicit state and limited case-history memory. The central boundary is clear: memory improves continuity, while authorization and approval remain external to the model. The MCP deliverable is ready to guide future implementation but is not yet an operational integration. </w:t>
+        <w:t>The group produced the Week 6 design artifacts, prototype code and MCP-style specification, and the four-scenario demo ran successfully in the terminal output provided. The output supports the state, memory-read/write, ownership-denial and approval-gate flows</w:t>
       </w:r>
       <w:r>
         <w:rPr>
@@ -1086,42 +1054,31 @@
           <w:color w:val="000000"/>
           <w:sz w:val="24"/>
           <w:szCs w:val="24"/>
-          <w:lang w:val="en-US" w:eastAsia="zh-CN"/>
+          <w:lang w:val="en-US"/>
         </w:rPr>
-        <w:t xml:space="preserve">The Week 6 memory and state demonstration is implemented in code. The repository does not yet </w:t>
+        <w:t>.</w:t>
       </w:r>
-      <w:bookmarkStart w:id="0" w:name="_GoBack"/>
-      <w:bookmarkEnd w:id="0"/>
       <w:r>
         <w:rPr>
           <w:rFonts w:hint="default" w:ascii="Times New Roman" w:hAnsi="Times New Roman" w:cs="Times New Roman"/>
           <w:color w:val="000000"/>
           <w:sz w:val="24"/>
           <w:szCs w:val="24"/>
-          <w:lang w:val="en-US" w:eastAsia="zh-CN"/>
         </w:rPr>
-        <w:t>include saved output from an executed run.</w:t>
+        <w:t xml:space="preserve"> The MCP specification remains a design deliverable, not an operational integration</w:t>
       </w:r>
-    </w:p>
-    <w:p>
-      <w:pPr>
-        <w:spacing w:after="100"/>
-        <w:jc w:val="both"/>
+      <w:r>
         <w:rPr>
           <w:rFonts w:hint="default" w:ascii="Times New Roman" w:hAnsi="Times New Roman" w:cs="Times New Roman"/>
+          <w:color w:val="000000"/>
           <w:sz w:val="24"/>
           <w:szCs w:val="24"/>
+          <w:lang w:val="en-US"/>
         </w:rPr>
-      </w:pPr>
-    </w:p>
-    <w:p>
-      <w:pPr>
-        <w:spacing w:before="160" w:after="0"/>
-        <w:jc w:val="both"/>
-        <w:rPr>
-          <w:rFonts w:hint="default" w:ascii="Times New Roman" w:hAnsi="Times New Roman" w:cs="Times New Roman"/>
-        </w:rPr>
-      </w:pPr>
+        <w:t>.</w:t>
+      </w:r>
+      <w:bookmarkStart w:id="0" w:name="_GoBack"/>
+      <w:bookmarkEnd w:id="0"/>
     </w:p>
     <w:sectPr>
       <w:pgSz w:w="12240" w:h="15840"/>

</xml_diff>

<commit_message>
#123tp5xbj2k Modified the week6 project report and added the demo run evidence
</commit_message>
<xml_diff>
--- a/docs/weekly-reports/Week6_Progress_Report.docx
+++ b/docs/weekly-reports/Week6_Progress_Report.docx
@@ -284,6 +284,7 @@
         <w:rPr>
           <w:rFonts w:hint="default" w:ascii="Times New Roman" w:hAnsi="Times New Roman" w:cs="Times New Roman"/>
           <w:b/>
+          <w:bCs/>
           <w:color w:val="000000"/>
           <w:sz w:val="24"/>
           <w:szCs w:val="24"/>
@@ -297,7 +298,7 @@
           <w:sz w:val="24"/>
           <w:szCs w:val="24"/>
         </w:rPr>
-        <w:t>The provided terminal output shows all four scenarios completed with passing assertions: ticket created and saved to memory (TICKET_CREATED); returning customer’s ticket status retrieved (TICKET_STATUS_RETURNED); cross-customer access denied (AUTHORIZATION_DENIED); and escalation completed after a simulated approval (ESCALATED_AFTER_APPROVAL). Scenario 2’s scripted action already contains the ticket ID, so the run confirms memory was loaded and the lookup succeeded, but does not isolate memory as the reason the planner selected that ID. The run output was shared for this report but is not yet archived in the repository.</w:t>
+        <w:t>The provided terminal output shows all four scenarios completed with passing assertions: ticket created and saved to memory (TICKET_CREATED); returning customer’s ticket status retrieved (TICKET_STATUS_RETURNED); cross-customer access denied (AUTHORIZATION_DENIED); and escalation completed after a simulated approval (ESCALATED_AFTER_APPROVAL). Scenario 2’s scripted action already contains the ticket ID, so the run confirms memory was loaded and the lookup succeeded, but does not isolate memory as the reason the planner selected that ID. The run transcript is archived at evidence/traces/week6/demo-week6-run-2026-10-09.txt.</w:t>
       </w:r>
     </w:p>
     <w:p>
@@ -394,7 +395,18 @@
           <w:sz w:val="24"/>
           <w:szCs w:val="24"/>
         </w:rPr>
-        <w:t>The documented use case is continuity for a returning customer with an open case. In the demo, the controller loaded the customer’s stored case and the ticket lookup returned its status without a ticket ID in the customer’s message. The scripted planner supplied that ID in its action, however, so a follow-up using the memory-aware Gemini planner would provide stronger evidence that memory itself drives the selection. Ownership checks bind reads to the session customer; memory cannot change identity, authorize escalation or determine a financial outcome. The escalation scenario also shows the approval gate still runs, using a simulated approval callback.</w:t>
+        <w:t>The documented use case is continuity for a returning customer with an open case. In the demo, the controller loaded the customer’s stored case and</w:t>
+      </w:r>
+      <w:bookmarkStart w:id="0" w:name="_GoBack"/>
+      <w:bookmarkEnd w:id="0"/>
+      <w:r>
+        <w:rPr>
+          <w:rFonts w:hint="default" w:ascii="Times New Roman" w:hAnsi="Times New Roman" w:cs="Times New Roman"/>
+          <w:color w:val="000000"/>
+          <w:sz w:val="24"/>
+          <w:szCs w:val="24"/>
+        </w:rPr>
+        <w:t xml:space="preserve"> the ticket lookup returned its status without a ticket ID in the customer’s message. The scripted planner supplied that ID in its action, however, so a follow-up using the memory-aware Gemini planner would provide stronger evidence that memory itself drives the selection. Ownership checks bind reads to the session customer; memory cannot change identity, authorize escalation or determine a financial outcome. The escalation scenario also shows the approval gate still runs, using a simulated approval callback.</w:t>
       </w:r>
     </w:p>
     <w:p>
@@ -511,6 +523,12 @@
             <w:insideH w:val="single" w:color="000000" w:sz="4" w:space="0"/>
             <w:insideV w:val="single" w:color="000000" w:sz="4" w:space="0"/>
           </w:tblBorders>
+          <w:tblCellMar>
+            <w:top w:w="0" w:type="dxa"/>
+            <w:left w:w="108" w:type="dxa"/>
+            <w:bottom w:w="0" w:type="dxa"/>
+            <w:right w:w="108" w:type="dxa"/>
+          </w:tblCellMar>
         </w:tblPrEx>
         <w:trPr>
           <w:jc w:val="center"/>
@@ -582,6 +600,12 @@
             <w:insideH w:val="single" w:color="000000" w:sz="4" w:space="0"/>
             <w:insideV w:val="single" w:color="000000" w:sz="4" w:space="0"/>
           </w:tblBorders>
+          <w:tblCellMar>
+            <w:top w:w="0" w:type="dxa"/>
+            <w:left w:w="108" w:type="dxa"/>
+            <w:bottom w:w="0" w:type="dxa"/>
+            <w:right w:w="108" w:type="dxa"/>
+          </w:tblCellMar>
         </w:tblPrEx>
         <w:trPr>
           <w:jc w:val="center"/>
@@ -720,6 +744,12 @@
             <w:insideH w:val="single" w:color="000000" w:sz="4" w:space="0"/>
             <w:insideV w:val="single" w:color="000000" w:sz="4" w:space="0"/>
           </w:tblBorders>
+          <w:tblCellMar>
+            <w:top w:w="0" w:type="dxa"/>
+            <w:left w:w="108" w:type="dxa"/>
+            <w:bottom w:w="0" w:type="dxa"/>
+            <w:right w:w="108" w:type="dxa"/>
+          </w:tblCellMar>
         </w:tblPrEx>
         <w:trPr>
           <w:jc w:val="center"/>
@@ -789,6 +819,12 @@
             <w:insideH w:val="single" w:color="000000" w:sz="4" w:space="0"/>
             <w:insideV w:val="single" w:color="000000" w:sz="4" w:space="0"/>
           </w:tblBorders>
+          <w:tblCellMar>
+            <w:top w:w="0" w:type="dxa"/>
+            <w:left w:w="108" w:type="dxa"/>
+            <w:bottom w:w="0" w:type="dxa"/>
+            <w:right w:w="108" w:type="dxa"/>
+          </w:tblCellMar>
         </w:tblPrEx>
         <w:trPr>
           <w:jc w:val="center"/>
@@ -840,7 +876,7 @@
                 <w:sz w:val="24"/>
                 <w:szCs w:val="24"/>
               </w:rPr>
-              <w:t>Run completed; all four scenario assertions passed in the terminal output provided. Transcript not yet archived in repository; Scenario 2 uses a scripted ticket ID.</w:t>
+              <w:t>Run completed; all four scenario assertions passed. Transcript: evidence/traces/week6/demo-week6-run-2026-10-09.txt. Scenario 2 uses a scripted ticket ID.</w:t>
             </w:r>
           </w:p>
         </w:tc>
@@ -855,6 +891,12 @@
             <w:insideH w:val="single" w:color="000000" w:sz="4" w:space="0"/>
             <w:insideV w:val="single" w:color="000000" w:sz="4" w:space="0"/>
           </w:tblBorders>
+          <w:tblCellMar>
+            <w:top w:w="0" w:type="dxa"/>
+            <w:left w:w="108" w:type="dxa"/>
+            <w:bottom w:w="0" w:type="dxa"/>
+            <w:right w:w="108" w:type="dxa"/>
+          </w:tblCellMar>
         </w:tblPrEx>
         <w:trPr>
           <w:jc w:val="center"/>
@@ -1077,8 +1119,6 @@
         </w:rPr>
         <w:t>.</w:t>
       </w:r>
-      <w:bookmarkStart w:id="0" w:name="_GoBack"/>
-      <w:bookmarkEnd w:id="0"/>
     </w:p>
     <w:sectPr>
       <w:pgSz w:w="12240" w:h="15840"/>

</xml_diff>